<commit_message>
Bổ sung vài chữ để Results và Bảng 8 tự đọc được
Analytic Plan nêu tên restricted cubic spline (Results và Discussion có
nhắc); chú thích Bảng 8 giải thích AME × 12 và trọng số Webb, 9.999 lần lặp.
Không đưa lại phần chi tiết đã chuyển sang Supplementary Methods S2-S3.

Co-Authored-By: Claude Opus 5.5 <noreply@anthropic.com>
Claude-Session: https://claude.ai/code/session_012tLfSWXFiJ8KJH7nwqmjYj
</commit_message>
<xml_diff>
--- a/docs/bai_nckh/srsp/Manuscript.docx
+++ b/docs/bai_nckh/srsp/Manuscript.docx
@@ -970,7 +970,7 @@
         <w:t xml:space="preserve"> </w:t>
       </w:r>
       <w:r>
-        <w:t xml:space="preserve">as missing, separated any exposure from intensity among exposed participants, tested for a nonlinear association, estimated a fractional logit model that respects the bounds of the PHQ-4 (Papke &amp; Wooldridge, 1996), used multiple imputation by chained equations (White et al., 2011), excluded flagged responses and influential observations, used a restricted wild bootstrap (Davidson &amp; Flachaire, 2008; Roodman et al., 2019), and omitted industry from the covariates. A specification curve (Simonsohn et al., 2020) combined four constructions of the stigma index, two sets of covariates, two definitions of the LGBT group, and the inclusion or exclusion of transgender and nonbinary participants, which yielded 32 specifications. Every result is reported, and no threshold was set for the share of specifications that must agree. Supplementary Methods S2 describes each analysis.</w:t>
+        <w:t xml:space="preserve">as missing, separated any exposure from intensity among exposed participants, tested for a nonlinear association with a restricted cubic spline, estimated a fractional logit model that respects the bounds of the PHQ-4 (Papke &amp; Wooldridge, 1996), used multiple imputation by chained equations (White et al., 2011), excluded flagged responses and influential observations, used a restricted wild bootstrap (Davidson &amp; Flachaire, 2008; Roodman et al., 2019), and omitted industry from the covariates. A specification curve (Simonsohn et al., 2020) combined four constructions of the stigma index, two sets of covariates, two definitions of the LGBT group, and the inclusion or exclusion of transgender and nonbinary participants, which yielded 32 specifications. Every result is reported, and no threshold was set for the share of specifications that must agree. Supplementary Methods S2 describes each analysis.</w:t>
       </w:r>
     </w:p>
     <w:p>
@@ -15689,7 +15689,7 @@
                 <w:rFonts w:ascii="Times New Roman" w:hAnsi="Times New Roman"/>
                 <w:sz w:val="20"/>
               </w:rPr>
-              <w:t xml:space="preserve">8. Restricted wild bootstrap (Webb, 9,999)</w:t>
+              <w:t xml:space="preserve">8. Restricted wild bootstrap</w:t>
             </w:r>
             <w:r>
               <w:rPr>
@@ -15919,7 +15919,7 @@
         <w:t xml:space="preserve"> </w:t>
       </w:r>
       <w:r>
-        <w:t xml:space="preserve">AME denotes the average marginal effect, and the confidence interval is</w:t>
+        <w:t xml:space="preserve">The fractional logit model was fitted to PHQ-4 scores divided by 12, and its average marginal effect (AME) was multiplied by 12 to return to the PHQ-4 scale. The confidence interval is</w:t>
       </w:r>
       <w:r>
         <w:t xml:space="preserve"> </w:t>
@@ -15966,7 +15966,7 @@
         <w:t xml:space="preserve"> </w:t>
       </w:r>
       <w:r>
-        <w:t xml:space="preserve">The confidence interval and</w:t>
+        <w:t xml:space="preserve">The bootstrap used Webb weights and 9,999 replications, and it provided the confidence interval and</w:t>
       </w:r>
       <w:r>
         <w:t xml:space="preserve"> </w:t>
@@ -15982,7 +15982,7 @@
         <w:t xml:space="preserve"> </w:t>
       </w:r>
       <w:r>
-        <w:t xml:space="preserve">value are from the bootstrap.</w:t>
+        <w:t xml:space="preserve">value.</w:t>
       </w:r>
     </w:p>
     <w:p>

</xml_diff>